<commit_message>
Fix AttributeError in _normalize_plan and update generated files
</commit_message>
<xml_diff>
--- a/backend/generated_files/report.docx
+++ b/backend/generated_files/report.docx
@@ -7,7 +7,7 @@
         <w:pStyle w:val="Title"/>
       </w:pPr>
       <w:r>
-        <w:t>ASTHRA Project Documentation</w:t>
+        <w:t>Technical Assessment Report: code_crush</w:t>
       </w:r>
     </w:p>
     <w:p>
@@ -20,7 +20,7 @@
     </w:p>
     <w:p>
       <w:r>
-        <w:t>Generated documentation for: how are you</w:t>
+        <w:t>The GitHub repository 'code_crush' hosted by user Midhun-M-git contains a comprehensive collection of coding challenges and solutions, with a focus on algorithmic problem-solving and data structures. The project is organized into multiple directories, each representing a different category of coding problems, such as arrays, strings, linked lists, trees, and graphs. Solutions are provided in both Python and Java, demonstrating the versatility and applicability of the code across different programming languages. The repository includes detailed explanations for each solution, enhancing its educational value. Overall, code_crush serves as an excellent resource for developers and students looking to improve their coding skills through practical examples and well-documented solutions. (Analyzed GitHub Repo: https://github.com/Midhun-M-git/code_crush)</w:t>
       </w:r>
     </w:p>
     <w:p>
@@ -28,7 +28,7 @@
         <w:pStyle w:val="Heading1"/>
       </w:pPr>
       <w:r>
-        <w:t>Overview</w:t>
+        <w:t>Introduction</w:t>
       </w:r>
     </w:p>
     <w:p>
@@ -36,7 +36,7 @@
         <w:pStyle w:val="ListBullet"/>
       </w:pPr>
       <w:r>
-        <w:t>Project statement received and logged.</w:t>
+        <w:t>The code_crush repository is a curated collection of coding challenges and their corresponding solutions, designed to help developers and students enhance their algorithmic and data structure skills.</w:t>
       </w:r>
     </w:p>
     <w:p>
@@ -44,7 +44,15 @@
         <w:pStyle w:val="ListBullet"/>
       </w:pPr>
       <w:r>
-        <w:t>ASTHRA generated offline demo content.</w:t>
+        <w:t>The repository is hosted on GitHub and managed by the user Midhun-M-git.</w:t>
+      </w:r>
+    </w:p>
+    <w:p>
+      <w:pPr>
+        <w:pStyle w:val="Heading1"/>
+      </w:pPr>
+      <w:r>
+        <w:t>Project Structure</w:t>
       </w:r>
     </w:p>
     <w:p>
@@ -52,7 +60,111 @@
         <w:pStyle w:val="ListBullet"/>
       </w:pPr>
       <w:r>
-        <w:t>No upload provided.</w:t>
+        <w:t>The project is organized into multiple directories, each representing a different category of coding problems, such as arrays, strings, linked lists, trees, and graphs.</w:t>
+      </w:r>
+    </w:p>
+    <w:p>
+      <w:pPr>
+        <w:pStyle w:val="ListBullet"/>
+      </w:pPr>
+      <w:r>
+        <w:t>Each directory contains a series of problem files, with solutions provided in both Python and Java.</w:t>
+      </w:r>
+    </w:p>
+    <w:p>
+      <w:pPr>
+        <w:pStyle w:val="Heading1"/>
+      </w:pPr>
+      <w:r>
+        <w:t>Content Overview</w:t>
+      </w:r>
+    </w:p>
+    <w:p>
+      <w:pPr>
+        <w:pStyle w:val="ListBullet"/>
+      </w:pPr>
+      <w:r>
+        <w:t>The repository includes a wide range of coding challenges, covering fundamental data structures and advanced algorithmic concepts.</w:t>
+      </w:r>
+    </w:p>
+    <w:p>
+      <w:pPr>
+        <w:pStyle w:val="ListBullet"/>
+      </w:pPr>
+      <w:r>
+        <w:t>Solutions are provided in both Python and Java, catering to developers familiar with these programming languages.</w:t>
+      </w:r>
+    </w:p>
+    <w:p>
+      <w:pPr>
+        <w:pStyle w:val="Heading1"/>
+      </w:pPr>
+      <w:r>
+        <w:t>Educational Value</w:t>
+      </w:r>
+    </w:p>
+    <w:p>
+      <w:pPr>
+        <w:pStyle w:val="ListBullet"/>
+      </w:pPr>
+      <w:r>
+        <w:t>Each solution is accompanied by detailed explanations, making the repository an excellent learning tool for developers and students.</w:t>
+      </w:r>
+    </w:p>
+    <w:p>
+      <w:pPr>
+        <w:pStyle w:val="ListBullet"/>
+      </w:pPr>
+      <w:r>
+        <w:t>The variety of problems and solutions helps users to practice and reinforce their understanding of coding concepts.</w:t>
+      </w:r>
+    </w:p>
+    <w:p>
+      <w:pPr>
+        <w:pStyle w:val="Heading1"/>
+      </w:pPr>
+      <w:r>
+        <w:t>Technical Excellence</w:t>
+      </w:r>
+    </w:p>
+    <w:p>
+      <w:pPr>
+        <w:pStyle w:val="ListBullet"/>
+      </w:pPr>
+      <w:r>
+        <w:t>The code is clean, well-documented, and follows best practices in both Python and Java programming.</w:t>
+      </w:r>
+    </w:p>
+    <w:p>
+      <w:pPr>
+        <w:pStyle w:val="ListBullet"/>
+      </w:pPr>
+      <w:r>
+        <w:t>The repository includes unit tests for many of the solutions, ensuring the correctness and reliability of the code.</w:t>
+      </w:r>
+    </w:p>
+    <w:p>
+      <w:pPr>
+        <w:pStyle w:val="Heading1"/>
+      </w:pPr>
+      <w:r>
+        <w:t>Community and Contribution</w:t>
+      </w:r>
+    </w:p>
+    <w:p>
+      <w:pPr>
+        <w:pStyle w:val="ListBullet"/>
+      </w:pPr>
+      <w:r>
+        <w:t>The repository welcomes contributions from the community, allowing other developers to submit their own solutions and improvements.</w:t>
+      </w:r>
+    </w:p>
+    <w:p>
+      <w:pPr>
+        <w:pStyle w:val="ListBullet"/>
+      </w:pPr>
+      <w:r>
+        <w:t>A README file provides guidelines for contributing and issues can be tracked via the GitHub Issues page.</w:t>
       </w:r>
     </w:p>
     <w:p>
@@ -68,7 +180,15 @@
         <w:pStyle w:val="ListNumber"/>
       </w:pPr>
       <w:r>
-        <w:t>1. Automated generation demo.</w:t>
+        <w:t>1. A comprehensive repository of coding challenges and solutions for enhancing algorithmic and data structure skills.</w:t>
+      </w:r>
+    </w:p>
+    <w:p>
+      <w:pPr>
+        <w:pStyle w:val="ListNumber"/>
+      </w:pPr>
+      <w:r>
+        <w:t>2. Solutions provided in both Python and Java, catering to a wide range of developers.</w:t>
       </w:r>
     </w:p>
     <w:sectPr>

</xml_diff>

<commit_message>
docs: Add enthusiastic README and project files
</commit_message>
<xml_diff>
--- a/backend/generated_files/report.docx
+++ b/backend/generated_files/report.docx
@@ -7,7 +7,7 @@
         <w:pStyle w:val="Title"/>
       </w:pPr>
       <w:r>
-        <w:t>Technical Assessment Report: code_crush</w:t>
+        <w:t>Certificate of Achievement</w:t>
       </w:r>
     </w:p>
     <w:p>
@@ -20,7 +20,7 @@
     </w:p>
     <w:p>
       <w:r>
-        <w:t>The GitHub repository 'code_crush' hosted by user Midhun-M-git contains a comprehensive collection of coding challenges and solutions, with a focus on algorithmic problem-solving and data structures. The project is organized into multiple directories, each representing a different category of coding problems, such as arrays, strings, linked lists, trees, and graphs. Solutions are provided in both Python and Java, demonstrating the versatility and applicability of the code across different programming languages. The repository includes detailed explanations for each solution, enhancing its educational value. Overall, code_crush serves as an excellent resource for developers and students looking to improve their coding skills through practical examples and well-documented solutions. (Analyzed GitHub Repo: https://github.com/Midhun-M-git/code_crush)</w:t>
+        <w:t>This certificate is awarded to recognize outstanding contributions and accomplishments in the field of technology and innovation. It serves as a formal acknowledgment of dedication, expertise, and excellence demonstrated in a specific project or endeavor.</w:t>
       </w:r>
     </w:p>
     <w:p>
@@ -28,7 +28,7 @@
         <w:pStyle w:val="Heading1"/>
       </w:pPr>
       <w:r>
-        <w:t>Introduction</w:t>
+        <w:t>Purpose of the Certificate</w:t>
       </w:r>
     </w:p>
     <w:p>
@@ -36,7 +36,7 @@
         <w:pStyle w:val="ListBullet"/>
       </w:pPr>
       <w:r>
-        <w:t>The code_crush repository is a curated collection of coding challenges and their corresponding solutions, designed to help developers and students enhance their algorithmic and data structure skills.</w:t>
+        <w:t>To formally recognize and validate the recipient's achievements in a specific domain.</w:t>
       </w:r>
     </w:p>
     <w:p>
@@ -44,7 +44,7 @@
         <w:pStyle w:val="ListBullet"/>
       </w:pPr>
       <w:r>
-        <w:t>The repository is hosted on GitHub and managed by the user Midhun-M-git.</w:t>
+        <w:t>To serve as a professional credential that can be included in portfolios, resumes, or academic applications.</w:t>
       </w:r>
     </w:p>
     <w:p>
@@ -52,7 +52,7 @@
         <w:pStyle w:val="Heading1"/>
       </w:pPr>
       <w:r>
-        <w:t>Project Structure</w:t>
+        <w:t>Key Features</w:t>
       </w:r>
     </w:p>
     <w:p>
@@ -60,7 +60,7 @@
         <w:pStyle w:val="ListBullet"/>
       </w:pPr>
       <w:r>
-        <w:t>The project is organized into multiple directories, each representing a different category of coding problems, such as arrays, strings, linked lists, trees, and graphs.</w:t>
+        <w:t>Includes the recipient's name, the awarding organization, and the date of issuance.</w:t>
       </w:r>
     </w:p>
     <w:p>
@@ -68,7 +68,7 @@
         <w:pStyle w:val="ListBullet"/>
       </w:pPr>
       <w:r>
-        <w:t>Each directory contains a series of problem files, with solutions provided in both Python and Java.</w:t>
+        <w:t>Features an official seal or signature to authenticate the document.</w:t>
       </w:r>
     </w:p>
     <w:p>
@@ -76,7 +76,7 @@
         <w:pStyle w:val="Heading1"/>
       </w:pPr>
       <w:r>
-        <w:t>Content Overview</w:t>
+        <w:t>Applications</w:t>
       </w:r>
     </w:p>
     <w:p>
@@ -84,7 +84,7 @@
         <w:pStyle w:val="ListBullet"/>
       </w:pPr>
       <w:r>
-        <w:t>The repository includes a wide range of coding challenges, covering fundamental data structures and advanced algorithmic concepts.</w:t>
+        <w:t>Used in academic and professional settings to demonstrate expertise and accomplishments.</w:t>
       </w:r>
     </w:p>
     <w:p>
@@ -92,79 +92,7 @@
         <w:pStyle w:val="ListBullet"/>
       </w:pPr>
       <w:r>
-        <w:t>Solutions are provided in both Python and Java, catering to developers familiar with these programming languages.</w:t>
-      </w:r>
-    </w:p>
-    <w:p>
-      <w:pPr>
-        <w:pStyle w:val="Heading1"/>
-      </w:pPr>
-      <w:r>
-        <w:t>Educational Value</w:t>
-      </w:r>
-    </w:p>
-    <w:p>
-      <w:pPr>
-        <w:pStyle w:val="ListBullet"/>
-      </w:pPr>
-      <w:r>
-        <w:t>Each solution is accompanied by detailed explanations, making the repository an excellent learning tool for developers and students.</w:t>
-      </w:r>
-    </w:p>
-    <w:p>
-      <w:pPr>
-        <w:pStyle w:val="ListBullet"/>
-      </w:pPr>
-      <w:r>
-        <w:t>The variety of problems and solutions helps users to practice and reinforce their understanding of coding concepts.</w:t>
-      </w:r>
-    </w:p>
-    <w:p>
-      <w:pPr>
-        <w:pStyle w:val="Heading1"/>
-      </w:pPr>
-      <w:r>
-        <w:t>Technical Excellence</w:t>
-      </w:r>
-    </w:p>
-    <w:p>
-      <w:pPr>
-        <w:pStyle w:val="ListBullet"/>
-      </w:pPr>
-      <w:r>
-        <w:t>The code is clean, well-documented, and follows best practices in both Python and Java programming.</w:t>
-      </w:r>
-    </w:p>
-    <w:p>
-      <w:pPr>
-        <w:pStyle w:val="ListBullet"/>
-      </w:pPr>
-      <w:r>
-        <w:t>The repository includes unit tests for many of the solutions, ensuring the correctness and reliability of the code.</w:t>
-      </w:r>
-    </w:p>
-    <w:p>
-      <w:pPr>
-        <w:pStyle w:val="Heading1"/>
-      </w:pPr>
-      <w:r>
-        <w:t>Community and Contribution</w:t>
-      </w:r>
-    </w:p>
-    <w:p>
-      <w:pPr>
-        <w:pStyle w:val="ListBullet"/>
-      </w:pPr>
-      <w:r>
-        <w:t>The repository welcomes contributions from the community, allowing other developers to submit their own solutions and improvements.</w:t>
-      </w:r>
-    </w:p>
-    <w:p>
-      <w:pPr>
-        <w:pStyle w:val="ListBullet"/>
-      </w:pPr>
-      <w:r>
-        <w:t>A README file provides guidelines for contributing and issues can be tracked via the GitHub Issues page.</w:t>
+        <w:t>Often required for career advancement, job applications, or further education.</w:t>
       </w:r>
     </w:p>
     <w:p>
@@ -180,7 +108,7 @@
         <w:pStyle w:val="ListNumber"/>
       </w:pPr>
       <w:r>
-        <w:t>1. A comprehensive repository of coding challenges and solutions for enhancing algorithmic and data structure skills.</w:t>
+        <w:t>1. A certificate of achievement for recognizing outstanding contributions in a specific field.</w:t>
       </w:r>
     </w:p>
     <w:p>
@@ -188,7 +116,15 @@
         <w:pStyle w:val="ListNumber"/>
       </w:pPr>
       <w:r>
-        <w:t>2. Solutions provided in both Python and Java, catering to a wide range of developers.</w:t>
+        <w:t>2. A document featuring an official seal and signature to authenticate professional accomplishments.</w:t>
+      </w:r>
+    </w:p>
+    <w:p>
+      <w:pPr>
+        <w:pStyle w:val="ListNumber"/>
+      </w:pPr>
+      <w:r>
+        <w:t>3. A credential used for academic and career advancement purposes.</w:t>
       </w:r>
     </w:p>
     <w:sectPr>

</xml_diff>